<commit_message>
updated the screenshot docx file
</commit_message>
<xml_diff>
--- a/GroupProject.docx
+++ b/GroupProject.docx
@@ -319,12 +319,12 @@
           <wp:inline distB="114300" distT="114300" distL="114300" distR="114300">
             <wp:extent cx="5943600" cy="1473200"/>
             <wp:effectExtent b="0" l="0" r="0" t="0"/>
-            <wp:docPr id="7" name="image7.png"/>
+            <wp:docPr id="9" name="image19.png"/>
             <a:graphic>
               <a:graphicData uri="http://schemas.openxmlformats.org/drawingml/2006/picture">
                 <pic:pic>
                   <pic:nvPicPr>
-                    <pic:cNvPr id="0" name="image7.png"/>
+                    <pic:cNvPr id="0" name="image19.png"/>
                     <pic:cNvPicPr preferRelativeResize="0"/>
                   </pic:nvPicPr>
                   <pic:blipFill>
@@ -392,12 +392,12 @@
           <wp:inline distB="114300" distT="114300" distL="114300" distR="114300">
             <wp:extent cx="5943600" cy="2755900"/>
             <wp:effectExtent b="0" l="0" r="0" t="0"/>
-            <wp:docPr id="16" name="image3.png"/>
+            <wp:docPr id="27" name="image15.png"/>
             <a:graphic>
               <a:graphicData uri="http://schemas.openxmlformats.org/drawingml/2006/picture">
                 <pic:pic>
                   <pic:nvPicPr>
-                    <pic:cNvPr id="0" name="image3.png"/>
+                    <pic:cNvPr id="0" name="image15.png"/>
                     <pic:cNvPicPr preferRelativeResize="0"/>
                   </pic:nvPicPr>
                   <pic:blipFill>
@@ -503,12 +503,12 @@
           <wp:inline distB="114300" distT="114300" distL="114300" distR="114300">
             <wp:extent cx="5943600" cy="1460500"/>
             <wp:effectExtent b="0" l="0" r="0" t="0"/>
-            <wp:docPr id="4" name="image18.png"/>
+            <wp:docPr id="5" name="image1.png"/>
             <a:graphic>
               <a:graphicData uri="http://schemas.openxmlformats.org/drawingml/2006/picture">
                 <pic:pic>
                   <pic:nvPicPr>
-                    <pic:cNvPr id="0" name="image18.png"/>
+                    <pic:cNvPr id="0" name="image1.png"/>
                     <pic:cNvPicPr preferRelativeResize="0"/>
                   </pic:nvPicPr>
                   <pic:blipFill>
@@ -576,12 +576,12 @@
           <wp:inline distB="114300" distT="114300" distL="114300" distR="114300">
             <wp:extent cx="5943600" cy="1384300"/>
             <wp:effectExtent b="0" l="0" r="0" t="0"/>
-            <wp:docPr id="15" name="image12.png"/>
+            <wp:docPr id="26" name="image36.png"/>
             <a:graphic>
               <a:graphicData uri="http://schemas.openxmlformats.org/drawingml/2006/picture">
                 <pic:pic>
                   <pic:nvPicPr>
-                    <pic:cNvPr id="0" name="image12.png"/>
+                    <pic:cNvPr id="0" name="image36.png"/>
                     <pic:cNvPicPr preferRelativeResize="0"/>
                   </pic:nvPicPr>
                   <pic:blipFill>
@@ -687,12 +687,12 @@
           <wp:inline distB="114300" distT="114300" distL="114300" distR="114300">
             <wp:extent cx="5943600" cy="1206500"/>
             <wp:effectExtent b="0" l="0" r="0" t="0"/>
-            <wp:docPr id="17" name="image13.png"/>
+            <wp:docPr id="28" name="image16.png"/>
             <a:graphic>
               <a:graphicData uri="http://schemas.openxmlformats.org/drawingml/2006/picture">
                 <pic:pic>
                   <pic:nvPicPr>
-                    <pic:cNvPr id="0" name="image13.png"/>
+                    <pic:cNvPr id="0" name="image16.png"/>
                     <pic:cNvPicPr preferRelativeResize="0"/>
                   </pic:nvPicPr>
                   <pic:blipFill>
@@ -798,12 +798,12 @@
           <wp:inline distB="114300" distT="114300" distL="114300" distR="114300">
             <wp:extent cx="5943600" cy="1384300"/>
             <wp:effectExtent b="0" l="0" r="0" t="0"/>
-            <wp:docPr id="9" name="image6.png"/>
+            <wp:docPr id="15" name="image3.png"/>
             <a:graphic>
               <a:graphicData uri="http://schemas.openxmlformats.org/drawingml/2006/picture">
                 <pic:pic>
                   <pic:nvPicPr>
-                    <pic:cNvPr id="0" name="image6.png"/>
+                    <pic:cNvPr id="0" name="image3.png"/>
                     <pic:cNvPicPr preferRelativeResize="0"/>
                   </pic:nvPicPr>
                   <pic:blipFill>
@@ -839,12 +839,12 @@
           <wp:inline distB="114300" distT="114300" distL="114300" distR="114300">
             <wp:extent cx="5943600" cy="1511300"/>
             <wp:effectExtent b="0" l="0" r="0" t="0"/>
-            <wp:docPr id="14" name="image14.png"/>
+            <wp:docPr id="25" name="image21.png"/>
             <a:graphic>
               <a:graphicData uri="http://schemas.openxmlformats.org/drawingml/2006/picture">
                 <pic:pic>
                   <pic:nvPicPr>
-                    <pic:cNvPr id="0" name="image14.png"/>
+                    <pic:cNvPr id="0" name="image21.png"/>
                     <pic:cNvPicPr preferRelativeResize="0"/>
                   </pic:nvPicPr>
                   <pic:blipFill>
@@ -950,12 +950,12 @@
           <wp:inline distB="114300" distT="114300" distL="114300" distR="114300">
             <wp:extent cx="5943600" cy="1422400"/>
             <wp:effectExtent b="0" l="0" r="0" t="0"/>
-            <wp:docPr id="11" name="image16.png"/>
+            <wp:docPr id="20" name="image4.png"/>
             <a:graphic>
               <a:graphicData uri="http://schemas.openxmlformats.org/drawingml/2006/picture">
                 <pic:pic>
                   <pic:nvPicPr>
-                    <pic:cNvPr id="0" name="image16.png"/>
+                    <pic:cNvPr id="0" name="image4.png"/>
                     <pic:cNvPicPr preferRelativeResize="0"/>
                   </pic:nvPicPr>
                   <pic:blipFill>
@@ -1023,12 +1023,12 @@
           <wp:inline distB="114300" distT="114300" distL="114300" distR="114300">
             <wp:extent cx="4095750" cy="1543050"/>
             <wp:effectExtent b="0" l="0" r="0" t="0"/>
-            <wp:docPr id="12" name="image20.png"/>
+            <wp:docPr id="21" name="image24.png"/>
             <a:graphic>
               <a:graphicData uri="http://schemas.openxmlformats.org/drawingml/2006/picture">
                 <pic:pic>
                   <pic:nvPicPr>
-                    <pic:cNvPr id="0" name="image20.png"/>
+                    <pic:cNvPr id="0" name="image24.png"/>
                     <pic:cNvPicPr preferRelativeResize="0"/>
                   </pic:nvPicPr>
                   <pic:blipFill>
@@ -1134,12 +1134,12 @@
           <wp:inline distB="114300" distT="114300" distL="114300" distR="114300">
             <wp:extent cx="5943600" cy="1828800"/>
             <wp:effectExtent b="0" l="0" r="0" t="0"/>
-            <wp:docPr id="6" name="image9.png"/>
+            <wp:docPr id="8" name="image2.png"/>
             <a:graphic>
               <a:graphicData uri="http://schemas.openxmlformats.org/drawingml/2006/picture">
                 <pic:pic>
                   <pic:nvPicPr>
-                    <pic:cNvPr id="0" name="image9.png"/>
+                    <pic:cNvPr id="0" name="image2.png"/>
                     <pic:cNvPicPr preferRelativeResize="0"/>
                   </pic:nvPicPr>
                   <pic:blipFill>
@@ -1207,12 +1207,12 @@
           <wp:inline distB="114300" distT="114300" distL="114300" distR="114300">
             <wp:extent cx="4791075" cy="2238375"/>
             <wp:effectExtent b="0" l="0" r="0" t="0"/>
-            <wp:docPr id="8" name="image26.png"/>
+            <wp:docPr id="14" name="image10.png"/>
             <a:graphic>
               <a:graphicData uri="http://schemas.openxmlformats.org/drawingml/2006/picture">
                 <pic:pic>
                   <pic:nvPicPr>
-                    <pic:cNvPr id="0" name="image26.png"/>
+                    <pic:cNvPr id="0" name="image10.png"/>
                     <pic:cNvPicPr preferRelativeResize="0"/>
                   </pic:nvPicPr>
                   <pic:blipFill>
@@ -1318,12 +1318,12 @@
           <wp:inline distB="114300" distT="114300" distL="114300" distR="114300">
             <wp:extent cx="5943600" cy="1612900"/>
             <wp:effectExtent b="0" l="0" r="0" t="0"/>
-            <wp:docPr id="29" name="image24.png"/>
+            <wp:docPr id="43" name="image34.png"/>
             <a:graphic>
               <a:graphicData uri="http://schemas.openxmlformats.org/drawingml/2006/picture">
                 <pic:pic>
                   <pic:nvPicPr>
-                    <pic:cNvPr id="0" name="image24.png"/>
+                    <pic:cNvPr id="0" name="image34.png"/>
                     <pic:cNvPicPr preferRelativeResize="0"/>
                   </pic:nvPicPr>
                   <pic:blipFill>
@@ -1391,12 +1391,12 @@
           <wp:inline distB="114300" distT="114300" distL="114300" distR="114300">
             <wp:extent cx="3095625" cy="1581150"/>
             <wp:effectExtent b="0" l="0" r="0" t="0"/>
-            <wp:docPr id="5" name="image5.png"/>
+            <wp:docPr id="7" name="image9.png"/>
             <a:graphic>
               <a:graphicData uri="http://schemas.openxmlformats.org/drawingml/2006/picture">
                 <pic:pic>
                   <pic:nvPicPr>
-                    <pic:cNvPr id="0" name="image5.png"/>
+                    <pic:cNvPr id="0" name="image9.png"/>
                     <pic:cNvPicPr preferRelativeResize="0"/>
                   </pic:nvPicPr>
                   <pic:blipFill>
@@ -1502,12 +1502,12 @@
           <wp:inline distB="114300" distT="114300" distL="114300" distR="114300">
             <wp:extent cx="5943600" cy="1562100"/>
             <wp:effectExtent b="0" l="0" r="0" t="0"/>
-            <wp:docPr id="13" name="image4.png"/>
+            <wp:docPr id="22" name="image11.png"/>
             <a:graphic>
               <a:graphicData uri="http://schemas.openxmlformats.org/drawingml/2006/picture">
                 <pic:pic>
                   <pic:nvPicPr>
-                    <pic:cNvPr id="0" name="image4.png"/>
+                    <pic:cNvPr id="0" name="image11.png"/>
                     <pic:cNvPicPr preferRelativeResize="0"/>
                   </pic:nvPicPr>
                   <pic:blipFill>
@@ -1575,7 +1575,7 @@
           <wp:inline distB="114300" distT="114300" distL="114300" distR="114300">
             <wp:extent cx="4686300" cy="3819525"/>
             <wp:effectExtent b="0" l="0" r="0" t="0"/>
-            <wp:docPr id="26" name="image27.png"/>
+            <wp:docPr id="39" name="image27.png"/>
             <a:graphic>
               <a:graphicData uri="http://schemas.openxmlformats.org/drawingml/2006/picture">
                 <pic:pic>
@@ -1686,12 +1686,12 @@
           <wp:inline distB="114300" distT="114300" distL="114300" distR="114300">
             <wp:extent cx="5943600" cy="1270000"/>
             <wp:effectExtent b="0" l="0" r="0" t="0"/>
-            <wp:docPr id="19" name="image28.png"/>
+            <wp:docPr id="30" name="image42.png"/>
             <a:graphic>
               <a:graphicData uri="http://schemas.openxmlformats.org/drawingml/2006/picture">
                 <pic:pic>
                   <pic:nvPicPr>
-                    <pic:cNvPr id="0" name="image28.png"/>
+                    <pic:cNvPr id="0" name="image42.png"/>
                     <pic:cNvPicPr preferRelativeResize="0"/>
                   </pic:nvPicPr>
                   <pic:blipFill>
@@ -1759,7 +1759,7 @@
           <wp:inline distB="114300" distT="114300" distL="114300" distR="114300">
             <wp:extent cx="4305300" cy="2676525"/>
             <wp:effectExtent b="0" l="0" r="0" t="0"/>
-            <wp:docPr id="28" name="image29.png"/>
+            <wp:docPr id="41" name="image29.png"/>
             <a:graphic>
               <a:graphicData uri="http://schemas.openxmlformats.org/drawingml/2006/picture">
                 <pic:pic>
@@ -1870,12 +1870,12 @@
           <wp:inline distB="114300" distT="114300" distL="114300" distR="114300">
             <wp:extent cx="5943600" cy="1054100"/>
             <wp:effectExtent b="0" l="0" r="0" t="0"/>
-            <wp:docPr id="24" name="image23.png"/>
+            <wp:docPr id="37" name="image28.png"/>
             <a:graphic>
               <a:graphicData uri="http://schemas.openxmlformats.org/drawingml/2006/picture">
                 <pic:pic>
                   <pic:nvPicPr>
-                    <pic:cNvPr id="0" name="image23.png"/>
+                    <pic:cNvPr id="0" name="image28.png"/>
                     <pic:cNvPicPr preferRelativeResize="0"/>
                   </pic:nvPicPr>
                   <pic:blipFill>
@@ -1943,12 +1943,12 @@
           <wp:inline distB="114300" distT="114300" distL="114300" distR="114300">
             <wp:extent cx="5943600" cy="6134100"/>
             <wp:effectExtent b="0" l="0" r="0" t="0"/>
-            <wp:docPr id="10" name="image11.png"/>
+            <wp:docPr id="19" name="image23.png"/>
             <a:graphic>
               <a:graphicData uri="http://schemas.openxmlformats.org/drawingml/2006/picture">
                 <pic:pic>
                   <pic:nvPicPr>
-                    <pic:cNvPr id="0" name="image11.png"/>
+                    <pic:cNvPr id="0" name="image23.png"/>
                     <pic:cNvPicPr preferRelativeResize="0"/>
                   </pic:nvPicPr>
                   <pic:blipFill>
@@ -2054,12 +2054,12 @@
           <wp:inline distB="114300" distT="114300" distL="114300" distR="114300">
             <wp:extent cx="5943600" cy="1511300"/>
             <wp:effectExtent b="0" l="0" r="0" t="0"/>
-            <wp:docPr id="18" name="image15.png"/>
+            <wp:docPr id="29" name="image18.png"/>
             <a:graphic>
               <a:graphicData uri="http://schemas.openxmlformats.org/drawingml/2006/picture">
                 <pic:pic>
                   <pic:nvPicPr>
-                    <pic:cNvPr id="0" name="image15.png"/>
+                    <pic:cNvPr id="0" name="image18.png"/>
                     <pic:cNvPicPr preferRelativeResize="0"/>
                   </pic:nvPicPr>
                   <pic:blipFill>
@@ -2127,12 +2127,12 @@
           <wp:inline distB="114300" distT="114300" distL="114300" distR="114300">
             <wp:extent cx="5343525" cy="1190625"/>
             <wp:effectExtent b="0" l="0" r="0" t="0"/>
-            <wp:docPr id="3" name="image2.png"/>
+            <wp:docPr id="4" name="image20.png"/>
             <a:graphic>
               <a:graphicData uri="http://schemas.openxmlformats.org/drawingml/2006/picture">
                 <pic:pic>
                   <pic:nvPicPr>
-                    <pic:cNvPr id="0" name="image2.png"/>
+                    <pic:cNvPr id="0" name="image20.png"/>
                     <pic:cNvPicPr preferRelativeResize="0"/>
                   </pic:nvPicPr>
                   <pic:blipFill>
@@ -2238,12 +2238,12 @@
           <wp:inline distB="114300" distT="114300" distL="114300" distR="114300">
             <wp:extent cx="5943600" cy="977900"/>
             <wp:effectExtent b="0" l="0" r="0" t="0"/>
-            <wp:docPr id="1" name="image1.png"/>
+            <wp:docPr id="1" name="image17.png"/>
             <a:graphic>
               <a:graphicData uri="http://schemas.openxmlformats.org/drawingml/2006/picture">
                 <pic:pic>
                   <pic:nvPicPr>
-                    <pic:cNvPr id="0" name="image1.png"/>
+                    <pic:cNvPr id="0" name="image17.png"/>
                     <pic:cNvPicPr preferRelativeResize="0"/>
                   </pic:nvPicPr>
                   <pic:blipFill>
@@ -2311,12 +2311,12 @@
           <wp:inline distB="114300" distT="114300" distL="114300" distR="114300">
             <wp:extent cx="3352800" cy="1990725"/>
             <wp:effectExtent b="0" l="0" r="0" t="0"/>
-            <wp:docPr id="27" name="image22.png"/>
+            <wp:docPr id="40" name="image30.png"/>
             <a:graphic>
               <a:graphicData uri="http://schemas.openxmlformats.org/drawingml/2006/picture">
                 <pic:pic>
                   <pic:nvPicPr>
-                    <pic:cNvPr id="0" name="image22.png"/>
+                    <pic:cNvPr id="0" name="image30.png"/>
                     <pic:cNvPicPr preferRelativeResize="0"/>
                   </pic:nvPicPr>
                   <pic:blipFill>
@@ -2422,12 +2422,12 @@
           <wp:inline distB="114300" distT="114300" distL="114300" distR="114300">
             <wp:extent cx="5943600" cy="1028700"/>
             <wp:effectExtent b="0" l="0" r="0" t="0"/>
-            <wp:docPr id="21" name="image21.png"/>
+            <wp:docPr id="33" name="image32.png"/>
             <a:graphic>
               <a:graphicData uri="http://schemas.openxmlformats.org/drawingml/2006/picture">
                 <pic:pic>
                   <pic:nvPicPr>
-                    <pic:cNvPr id="0" name="image21.png"/>
+                    <pic:cNvPr id="0" name="image32.png"/>
                     <pic:cNvPicPr preferRelativeResize="0"/>
                   </pic:nvPicPr>
                   <pic:blipFill>
@@ -2495,12 +2495,12 @@
           <wp:inline distB="114300" distT="114300" distL="114300" distR="114300">
             <wp:extent cx="5943600" cy="914400"/>
             <wp:effectExtent b="0" l="0" r="0" t="0"/>
-            <wp:docPr id="23" name="image19.png"/>
+            <wp:docPr id="36" name="image43.png"/>
             <a:graphic>
               <a:graphicData uri="http://schemas.openxmlformats.org/drawingml/2006/picture">
                 <pic:pic>
                   <pic:nvPicPr>
-                    <pic:cNvPr id="0" name="image19.png"/>
+                    <pic:cNvPr id="0" name="image43.png"/>
                     <pic:cNvPicPr preferRelativeResize="0"/>
                   </pic:nvPicPr>
                   <pic:blipFill>
@@ -2606,12 +2606,12 @@
           <wp:inline distB="114300" distT="114300" distL="114300" distR="114300">
             <wp:extent cx="5943600" cy="1244600"/>
             <wp:effectExtent b="0" l="0" r="0" t="0"/>
-            <wp:docPr id="2" name="image8.png"/>
+            <wp:docPr id="3" name="image5.png"/>
             <a:graphic>
               <a:graphicData uri="http://schemas.openxmlformats.org/drawingml/2006/picture">
                 <pic:pic>
                   <pic:nvPicPr>
-                    <pic:cNvPr id="0" name="image8.png"/>
+                    <pic:cNvPr id="0" name="image5.png"/>
                     <pic:cNvPicPr preferRelativeResize="0"/>
                   </pic:nvPicPr>
                   <pic:blipFill>
@@ -2679,12 +2679,12 @@
           <wp:inline distB="114300" distT="114300" distL="114300" distR="114300">
             <wp:extent cx="5543550" cy="4476750"/>
             <wp:effectExtent b="0" l="0" r="0" t="0"/>
-            <wp:docPr id="22" name="image17.png"/>
+            <wp:docPr id="35" name="image39.png"/>
             <a:graphic>
               <a:graphicData uri="http://schemas.openxmlformats.org/drawingml/2006/picture">
                 <pic:pic>
                   <pic:nvPicPr>
-                    <pic:cNvPr id="0" name="image17.png"/>
+                    <pic:cNvPr id="0" name="image39.png"/>
                     <pic:cNvPicPr preferRelativeResize="0"/>
                   </pic:nvPicPr>
                   <pic:blipFill>
@@ -2790,12 +2790,12 @@
           <wp:inline distB="114300" distT="114300" distL="114300" distR="114300">
             <wp:extent cx="5943600" cy="1651000"/>
             <wp:effectExtent b="0" l="0" r="0" t="0"/>
-            <wp:docPr id="25" name="image25.png"/>
+            <wp:docPr id="38" name="image37.png"/>
             <a:graphic>
               <a:graphicData uri="http://schemas.openxmlformats.org/drawingml/2006/picture">
                 <pic:pic>
                   <pic:nvPicPr>
-                    <pic:cNvPr id="0" name="image25.png"/>
+                    <pic:cNvPr id="0" name="image37.png"/>
                     <pic:cNvPicPr preferRelativeResize="0"/>
                   </pic:nvPicPr>
                   <pic:blipFill>
@@ -2863,12 +2863,12 @@
           <wp:inline distB="114300" distT="114300" distL="114300" distR="114300">
             <wp:extent cx="5438775" cy="1838325"/>
             <wp:effectExtent b="0" l="0" r="0" t="0"/>
-            <wp:docPr id="20" name="image10.png"/>
+            <wp:docPr id="32" name="image41.png"/>
             <a:graphic>
               <a:graphicData uri="http://schemas.openxmlformats.org/drawingml/2006/picture">
                 <pic:pic>
                   <pic:nvPicPr>
-                    <pic:cNvPr id="0" name="image10.png"/>
+                    <pic:cNvPr id="0" name="image41.png"/>
                     <pic:cNvPicPr preferRelativeResize="0"/>
                   </pic:nvPicPr>
                   <pic:blipFill>
@@ -2892,6 +2892,1332 @@
           </wp:inline>
         </w:drawing>
       </w:r>
+      <w:r>
+        <w:rPr>
+          <w:rtl w:val="0"/>
+        </w:rPr>
+      </w:r>
+    </w:p>
+    <w:p>
+      <w:pPr>
+        <w:rPr>
+          <w:rFonts w:ascii="Times New Roman" w:cs="Times New Roman" w:eastAsia="Times New Roman" w:hAnsi="Times New Roman"/>
+          <w:b w:val="1"/>
+          <w:bCs w:val="1"/>
+          <w:sz w:val="28"/>
+          <w:szCs w:val="28"/>
+        </w:rPr>
+      </w:pPr>
+      <w:r>
+        <w:rPr>
+          <w:rtl w:val="0"/>
+        </w:rPr>
+      </w:r>
+    </w:p>
+    <w:p>
+      <w:pPr>
+        <w:rPr>
+          <w:rFonts w:ascii="Times New Roman" w:cs="Times New Roman" w:eastAsia="Times New Roman" w:hAnsi="Times New Roman"/>
+          <w:b w:val="1"/>
+          <w:bCs w:val="1"/>
+          <w:sz w:val="28"/>
+          <w:szCs w:val="28"/>
+        </w:rPr>
+      </w:pPr>
+      <w:r>
+        <w:rPr>
+          <w:rFonts w:ascii="Times New Roman" w:cs="Times New Roman" w:eastAsia="Times New Roman" w:hAnsi="Times New Roman"/>
+          <w:b w:val="1"/>
+          <w:bCs w:val="1"/>
+          <w:sz w:val="28"/>
+          <w:szCs w:val="28"/>
+          <w:rtl w:val="0"/>
+        </w:rPr>
+        <w:t xml:space="preserve">Question 16</w:t>
+      </w:r>
+    </w:p>
+    <w:p>
+      <w:pPr>
+        <w:rPr>
+          <w:rFonts w:ascii="Times New Roman" w:cs="Times New Roman" w:eastAsia="Times New Roman" w:hAnsi="Times New Roman"/>
+          <w:b w:val="1"/>
+          <w:bCs w:val="1"/>
+          <w:sz w:val="28"/>
+          <w:szCs w:val="28"/>
+        </w:rPr>
+      </w:pPr>
+      <w:r>
+        <w:rPr>
+          <w:rtl w:val="0"/>
+        </w:rPr>
+      </w:r>
+    </w:p>
+    <w:p>
+      <w:pPr>
+        <w:rPr>
+          <w:rFonts w:ascii="Times New Roman" w:cs="Times New Roman" w:eastAsia="Times New Roman" w:hAnsi="Times New Roman"/>
+          <w:b w:val="1"/>
+          <w:bCs w:val="1"/>
+          <w:sz w:val="28"/>
+          <w:szCs w:val="28"/>
+        </w:rPr>
+      </w:pPr>
+      <w:r>
+        <w:rPr>
+          <w:rFonts w:ascii="Times New Roman" w:cs="Times New Roman" w:eastAsia="Times New Roman" w:hAnsi="Times New Roman"/>
+          <w:b w:val="1"/>
+          <w:bCs w:val="1"/>
+          <w:sz w:val="28"/>
+          <w:szCs w:val="28"/>
+        </w:rPr>
+        <w:drawing>
+          <wp:inline distB="114300" distT="114300" distL="114300" distR="114300">
+            <wp:extent cx="5943600" cy="876300"/>
+            <wp:effectExtent b="0" l="0" r="0" t="0"/>
+            <wp:docPr id="11" name="image14.png"/>
+            <a:graphic>
+              <a:graphicData uri="http://schemas.openxmlformats.org/drawingml/2006/picture">
+                <pic:pic>
+                  <pic:nvPicPr>
+                    <pic:cNvPr id="0" name="image14.png"/>
+                    <pic:cNvPicPr preferRelativeResize="0"/>
+                  </pic:nvPicPr>
+                  <pic:blipFill>
+                    <a:blip r:embed="rId35"/>
+                    <a:srcRect b="0" l="0" r="0" t="0"/>
+                    <a:stretch>
+                      <a:fillRect/>
+                    </a:stretch>
+                  </pic:blipFill>
+                  <pic:spPr>
+                    <a:xfrm>
+                      <a:off x="0" y="0"/>
+                      <a:ext cx="5943600" cy="876300"/>
+                    </a:xfrm>
+                    <a:prstGeom prst="rect"/>
+                    <a:ln/>
+                  </pic:spPr>
+                </pic:pic>
+              </a:graphicData>
+            </a:graphic>
+          </wp:inline>
+        </w:drawing>
+      </w:r>
+      <w:r>
+        <w:rPr>
+          <w:rtl w:val="0"/>
+        </w:rPr>
+      </w:r>
+    </w:p>
+    <w:p>
+      <w:pPr>
+        <w:rPr>
+          <w:rFonts w:ascii="Times New Roman" w:cs="Times New Roman" w:eastAsia="Times New Roman" w:hAnsi="Times New Roman"/>
+          <w:b w:val="1"/>
+          <w:bCs w:val="1"/>
+          <w:sz w:val="28"/>
+          <w:szCs w:val="28"/>
+        </w:rPr>
+      </w:pPr>
+      <w:r>
+        <w:rPr>
+          <w:rtl w:val="0"/>
+        </w:rPr>
+      </w:r>
+    </w:p>
+    <w:p>
+      <w:pPr>
+        <w:rPr>
+          <w:rFonts w:ascii="Times New Roman" w:cs="Times New Roman" w:eastAsia="Times New Roman" w:hAnsi="Times New Roman"/>
+          <w:b w:val="1"/>
+          <w:bCs w:val="1"/>
+          <w:sz w:val="28"/>
+          <w:szCs w:val="28"/>
+        </w:rPr>
+      </w:pPr>
+      <w:r>
+        <w:rPr>
+          <w:rFonts w:ascii="Times New Roman" w:cs="Times New Roman" w:eastAsia="Times New Roman" w:hAnsi="Times New Roman"/>
+          <w:b w:val="1"/>
+          <w:bCs w:val="1"/>
+          <w:sz w:val="28"/>
+          <w:szCs w:val="28"/>
+          <w:rtl w:val="0"/>
+        </w:rPr>
+        <w:t xml:space="preserve">Question 17</w:t>
+      </w:r>
+    </w:p>
+    <w:p>
+      <w:pPr>
+        <w:rPr>
+          <w:rFonts w:ascii="Times New Roman" w:cs="Times New Roman" w:eastAsia="Times New Roman" w:hAnsi="Times New Roman"/>
+          <w:b w:val="1"/>
+          <w:bCs w:val="1"/>
+          <w:sz w:val="28"/>
+          <w:szCs w:val="28"/>
+        </w:rPr>
+      </w:pPr>
+      <w:r>
+        <w:rPr>
+          <w:rtl w:val="0"/>
+        </w:rPr>
+      </w:r>
+    </w:p>
+    <w:p>
+      <w:pPr>
+        <w:rPr>
+          <w:rFonts w:ascii="Times New Roman" w:cs="Times New Roman" w:eastAsia="Times New Roman" w:hAnsi="Times New Roman"/>
+          <w:b w:val="1"/>
+          <w:bCs w:val="1"/>
+          <w:sz w:val="28"/>
+          <w:szCs w:val="28"/>
+        </w:rPr>
+      </w:pPr>
+      <w:r>
+        <w:rPr>
+          <w:rFonts w:ascii="Times New Roman" w:cs="Times New Roman" w:eastAsia="Times New Roman" w:hAnsi="Times New Roman"/>
+          <w:b w:val="1"/>
+          <w:bCs w:val="1"/>
+          <w:sz w:val="28"/>
+          <w:szCs w:val="28"/>
+        </w:rPr>
+        <w:drawing>
+          <wp:inline distB="114300" distT="114300" distL="114300" distR="114300">
+            <wp:extent cx="5943600" cy="673100"/>
+            <wp:effectExtent b="0" l="0" r="0" t="0"/>
+            <wp:docPr id="2" name="image7.png"/>
+            <a:graphic>
+              <a:graphicData uri="http://schemas.openxmlformats.org/drawingml/2006/picture">
+                <pic:pic>
+                  <pic:nvPicPr>
+                    <pic:cNvPr id="0" name="image7.png"/>
+                    <pic:cNvPicPr preferRelativeResize="0"/>
+                  </pic:nvPicPr>
+                  <pic:blipFill>
+                    <a:blip r:embed="rId36"/>
+                    <a:srcRect b="0" l="0" r="0" t="0"/>
+                    <a:stretch>
+                      <a:fillRect/>
+                    </a:stretch>
+                  </pic:blipFill>
+                  <pic:spPr>
+                    <a:xfrm>
+                      <a:off x="0" y="0"/>
+                      <a:ext cx="5943600" cy="673100"/>
+                    </a:xfrm>
+                    <a:prstGeom prst="rect"/>
+                    <a:ln/>
+                  </pic:spPr>
+                </pic:pic>
+              </a:graphicData>
+            </a:graphic>
+          </wp:inline>
+        </w:drawing>
+      </w:r>
+      <w:r>
+        <w:rPr>
+          <w:rtl w:val="0"/>
+        </w:rPr>
+      </w:r>
+    </w:p>
+    <w:p>
+      <w:pPr>
+        <w:rPr>
+          <w:rFonts w:ascii="Times New Roman" w:cs="Times New Roman" w:eastAsia="Times New Roman" w:hAnsi="Times New Roman"/>
+          <w:b w:val="1"/>
+          <w:bCs w:val="1"/>
+          <w:sz w:val="28"/>
+          <w:szCs w:val="28"/>
+        </w:rPr>
+      </w:pPr>
+      <w:r>
+        <w:rPr>
+          <w:rtl w:val="0"/>
+        </w:rPr>
+      </w:r>
+    </w:p>
+    <w:p>
+      <w:pPr>
+        <w:rPr>
+          <w:rFonts w:ascii="Times New Roman" w:cs="Times New Roman" w:eastAsia="Times New Roman" w:hAnsi="Times New Roman"/>
+          <w:b w:val="1"/>
+          <w:bCs w:val="1"/>
+          <w:sz w:val="28"/>
+          <w:szCs w:val="28"/>
+        </w:rPr>
+      </w:pPr>
+      <w:r>
+        <w:rPr>
+          <w:rFonts w:ascii="Times New Roman" w:cs="Times New Roman" w:eastAsia="Times New Roman" w:hAnsi="Times New Roman"/>
+          <w:b w:val="1"/>
+          <w:bCs w:val="1"/>
+          <w:sz w:val="28"/>
+          <w:szCs w:val="28"/>
+        </w:rPr>
+        <w:drawing>
+          <wp:inline distB="114300" distT="114300" distL="114300" distR="114300">
+            <wp:extent cx="3438525" cy="1447800"/>
+            <wp:effectExtent b="0" l="0" r="0" t="0"/>
+            <wp:docPr id="12" name="image25.png"/>
+            <a:graphic>
+              <a:graphicData uri="http://schemas.openxmlformats.org/drawingml/2006/picture">
+                <pic:pic>
+                  <pic:nvPicPr>
+                    <pic:cNvPr id="0" name="image25.png"/>
+                    <pic:cNvPicPr preferRelativeResize="0"/>
+                  </pic:nvPicPr>
+                  <pic:blipFill>
+                    <a:blip r:embed="rId37"/>
+                    <a:srcRect b="0" l="0" r="0" t="0"/>
+                    <a:stretch>
+                      <a:fillRect/>
+                    </a:stretch>
+                  </pic:blipFill>
+                  <pic:spPr>
+                    <a:xfrm>
+                      <a:off x="0" y="0"/>
+                      <a:ext cx="3438525" cy="1447800"/>
+                    </a:xfrm>
+                    <a:prstGeom prst="rect"/>
+                    <a:ln/>
+                  </pic:spPr>
+                </pic:pic>
+              </a:graphicData>
+            </a:graphic>
+          </wp:inline>
+        </w:drawing>
+      </w:r>
+      <w:r>
+        <w:rPr>
+          <w:rtl w:val="0"/>
+        </w:rPr>
+      </w:r>
+    </w:p>
+    <w:p>
+      <w:pPr>
+        <w:rPr>
+          <w:rFonts w:ascii="Times New Roman" w:cs="Times New Roman" w:eastAsia="Times New Roman" w:hAnsi="Times New Roman"/>
+          <w:b w:val="1"/>
+          <w:bCs w:val="1"/>
+          <w:sz w:val="28"/>
+          <w:szCs w:val="28"/>
+        </w:rPr>
+      </w:pPr>
+      <w:r>
+        <w:rPr>
+          <w:rtl w:val="0"/>
+        </w:rPr>
+      </w:r>
+    </w:p>
+    <w:p>
+      <w:pPr>
+        <w:rPr>
+          <w:rFonts w:ascii="Times New Roman" w:cs="Times New Roman" w:eastAsia="Times New Roman" w:hAnsi="Times New Roman"/>
+          <w:b w:val="1"/>
+          <w:bCs w:val="1"/>
+          <w:sz w:val="28"/>
+          <w:szCs w:val="28"/>
+        </w:rPr>
+      </w:pPr>
+      <w:r>
+        <w:rPr>
+          <w:rFonts w:ascii="Times New Roman" w:cs="Times New Roman" w:eastAsia="Times New Roman" w:hAnsi="Times New Roman"/>
+          <w:b w:val="1"/>
+          <w:bCs w:val="1"/>
+          <w:sz w:val="28"/>
+          <w:szCs w:val="28"/>
+          <w:rtl w:val="0"/>
+        </w:rPr>
+        <w:t xml:space="preserve">Question 18</w:t>
+      </w:r>
+    </w:p>
+    <w:p>
+      <w:pPr>
+        <w:rPr>
+          <w:rFonts w:ascii="Times New Roman" w:cs="Times New Roman" w:eastAsia="Times New Roman" w:hAnsi="Times New Roman"/>
+          <w:b w:val="1"/>
+          <w:bCs w:val="1"/>
+          <w:sz w:val="28"/>
+          <w:szCs w:val="28"/>
+        </w:rPr>
+      </w:pPr>
+      <w:r>
+        <w:rPr>
+          <w:rtl w:val="0"/>
+        </w:rPr>
+      </w:r>
+    </w:p>
+    <w:p>
+      <w:pPr>
+        <w:rPr>
+          <w:rFonts w:ascii="Times New Roman" w:cs="Times New Roman" w:eastAsia="Times New Roman" w:hAnsi="Times New Roman"/>
+          <w:b w:val="1"/>
+          <w:bCs w:val="1"/>
+          <w:sz w:val="28"/>
+          <w:szCs w:val="28"/>
+        </w:rPr>
+      </w:pPr>
+      <w:r>
+        <w:rPr>
+          <w:rFonts w:ascii="Times New Roman" w:cs="Times New Roman" w:eastAsia="Times New Roman" w:hAnsi="Times New Roman"/>
+          <w:b w:val="1"/>
+          <w:bCs w:val="1"/>
+          <w:sz w:val="28"/>
+          <w:szCs w:val="28"/>
+        </w:rPr>
+        <w:drawing>
+          <wp:inline distB="114300" distT="114300" distL="114300" distR="114300">
+            <wp:extent cx="5943600" cy="1257300"/>
+            <wp:effectExtent b="0" l="0" r="0" t="0"/>
+            <wp:docPr id="42" name="image38.png"/>
+            <a:graphic>
+              <a:graphicData uri="http://schemas.openxmlformats.org/drawingml/2006/picture">
+                <pic:pic>
+                  <pic:nvPicPr>
+                    <pic:cNvPr id="0" name="image38.png"/>
+                    <pic:cNvPicPr preferRelativeResize="0"/>
+                  </pic:nvPicPr>
+                  <pic:blipFill>
+                    <a:blip r:embed="rId38"/>
+                    <a:srcRect b="0" l="0" r="0" t="0"/>
+                    <a:stretch>
+                      <a:fillRect/>
+                    </a:stretch>
+                  </pic:blipFill>
+                  <pic:spPr>
+                    <a:xfrm>
+                      <a:off x="0" y="0"/>
+                      <a:ext cx="5943600" cy="1257300"/>
+                    </a:xfrm>
+                    <a:prstGeom prst="rect"/>
+                    <a:ln/>
+                  </pic:spPr>
+                </pic:pic>
+              </a:graphicData>
+            </a:graphic>
+          </wp:inline>
+        </w:drawing>
+      </w:r>
+      <w:r>
+        <w:rPr>
+          <w:rtl w:val="0"/>
+        </w:rPr>
+      </w:r>
+    </w:p>
+    <w:p>
+      <w:pPr>
+        <w:rPr>
+          <w:rFonts w:ascii="Times New Roman" w:cs="Times New Roman" w:eastAsia="Times New Roman" w:hAnsi="Times New Roman"/>
+          <w:b w:val="1"/>
+          <w:bCs w:val="1"/>
+          <w:sz w:val="28"/>
+          <w:szCs w:val="28"/>
+        </w:rPr>
+      </w:pPr>
+      <w:r>
+        <w:rPr>
+          <w:rtl w:val="0"/>
+        </w:rPr>
+      </w:r>
+    </w:p>
+    <w:p>
+      <w:pPr>
+        <w:rPr>
+          <w:rFonts w:ascii="Times New Roman" w:cs="Times New Roman" w:eastAsia="Times New Roman" w:hAnsi="Times New Roman"/>
+          <w:b w:val="1"/>
+          <w:bCs w:val="1"/>
+          <w:sz w:val="28"/>
+          <w:szCs w:val="28"/>
+        </w:rPr>
+      </w:pPr>
+      <w:r>
+        <w:rPr>
+          <w:rFonts w:ascii="Times New Roman" w:cs="Times New Roman" w:eastAsia="Times New Roman" w:hAnsi="Times New Roman"/>
+          <w:b w:val="1"/>
+          <w:bCs w:val="1"/>
+          <w:sz w:val="28"/>
+          <w:szCs w:val="28"/>
+        </w:rPr>
+        <w:drawing>
+          <wp:inline distB="114300" distT="114300" distL="114300" distR="114300">
+            <wp:extent cx="5943600" cy="1714500"/>
+            <wp:effectExtent b="0" l="0" r="0" t="0"/>
+            <wp:docPr id="10" name="image8.png"/>
+            <a:graphic>
+              <a:graphicData uri="http://schemas.openxmlformats.org/drawingml/2006/picture">
+                <pic:pic>
+                  <pic:nvPicPr>
+                    <pic:cNvPr id="0" name="image8.png"/>
+                    <pic:cNvPicPr preferRelativeResize="0"/>
+                  </pic:nvPicPr>
+                  <pic:blipFill>
+                    <a:blip r:embed="rId39"/>
+                    <a:srcRect b="0" l="0" r="0" t="0"/>
+                    <a:stretch>
+                      <a:fillRect/>
+                    </a:stretch>
+                  </pic:blipFill>
+                  <pic:spPr>
+                    <a:xfrm>
+                      <a:off x="0" y="0"/>
+                      <a:ext cx="5943600" cy="1714500"/>
+                    </a:xfrm>
+                    <a:prstGeom prst="rect"/>
+                    <a:ln/>
+                  </pic:spPr>
+                </pic:pic>
+              </a:graphicData>
+            </a:graphic>
+          </wp:inline>
+        </w:drawing>
+      </w:r>
+      <w:r>
+        <w:rPr>
+          <w:rtl w:val="0"/>
+        </w:rPr>
+      </w:r>
+    </w:p>
+    <w:p>
+      <w:pPr>
+        <w:rPr>
+          <w:rFonts w:ascii="Times New Roman" w:cs="Times New Roman" w:eastAsia="Times New Roman" w:hAnsi="Times New Roman"/>
+          <w:b w:val="1"/>
+          <w:bCs w:val="1"/>
+          <w:sz w:val="28"/>
+          <w:szCs w:val="28"/>
+        </w:rPr>
+      </w:pPr>
+      <w:r>
+        <w:rPr>
+          <w:rtl w:val="0"/>
+        </w:rPr>
+      </w:r>
+    </w:p>
+    <w:p>
+      <w:pPr>
+        <w:rPr>
+          <w:rFonts w:ascii="Times New Roman" w:cs="Times New Roman" w:eastAsia="Times New Roman" w:hAnsi="Times New Roman"/>
+          <w:b w:val="1"/>
+          <w:bCs w:val="1"/>
+          <w:sz w:val="28"/>
+          <w:szCs w:val="28"/>
+        </w:rPr>
+      </w:pPr>
+      <w:r>
+        <w:rPr>
+          <w:rFonts w:ascii="Times New Roman" w:cs="Times New Roman" w:eastAsia="Times New Roman" w:hAnsi="Times New Roman"/>
+          <w:b w:val="1"/>
+          <w:bCs w:val="1"/>
+          <w:sz w:val="28"/>
+          <w:szCs w:val="28"/>
+          <w:rtl w:val="0"/>
+        </w:rPr>
+        <w:t xml:space="preserve">Question 19</w:t>
+      </w:r>
+    </w:p>
+    <w:p>
+      <w:pPr>
+        <w:rPr>
+          <w:rFonts w:ascii="Times New Roman" w:cs="Times New Roman" w:eastAsia="Times New Roman" w:hAnsi="Times New Roman"/>
+          <w:b w:val="1"/>
+          <w:bCs w:val="1"/>
+          <w:sz w:val="28"/>
+          <w:szCs w:val="28"/>
+        </w:rPr>
+      </w:pPr>
+      <w:r>
+        <w:rPr>
+          <w:rtl w:val="0"/>
+        </w:rPr>
+      </w:r>
+    </w:p>
+    <w:p>
+      <w:pPr>
+        <w:rPr>
+          <w:rFonts w:ascii="Times New Roman" w:cs="Times New Roman" w:eastAsia="Times New Roman" w:hAnsi="Times New Roman"/>
+          <w:b w:val="1"/>
+          <w:bCs w:val="1"/>
+          <w:sz w:val="28"/>
+          <w:szCs w:val="28"/>
+        </w:rPr>
+      </w:pPr>
+      <w:r>
+        <w:rPr>
+          <w:rFonts w:ascii="Times New Roman" w:cs="Times New Roman" w:eastAsia="Times New Roman" w:hAnsi="Times New Roman"/>
+          <w:b w:val="1"/>
+          <w:bCs w:val="1"/>
+          <w:sz w:val="28"/>
+          <w:szCs w:val="28"/>
+        </w:rPr>
+        <w:drawing>
+          <wp:inline distB="114300" distT="114300" distL="114300" distR="114300">
+            <wp:extent cx="5943600" cy="1473200"/>
+            <wp:effectExtent b="0" l="0" r="0" t="0"/>
+            <wp:docPr id="13" name="image22.png"/>
+            <a:graphic>
+              <a:graphicData uri="http://schemas.openxmlformats.org/drawingml/2006/picture">
+                <pic:pic>
+                  <pic:nvPicPr>
+                    <pic:cNvPr id="0" name="image22.png"/>
+                    <pic:cNvPicPr preferRelativeResize="0"/>
+                  </pic:nvPicPr>
+                  <pic:blipFill>
+                    <a:blip r:embed="rId40"/>
+                    <a:srcRect b="0" l="0" r="0" t="0"/>
+                    <a:stretch>
+                      <a:fillRect/>
+                    </a:stretch>
+                  </pic:blipFill>
+                  <pic:spPr>
+                    <a:xfrm>
+                      <a:off x="0" y="0"/>
+                      <a:ext cx="5943600" cy="1473200"/>
+                    </a:xfrm>
+                    <a:prstGeom prst="rect"/>
+                    <a:ln/>
+                  </pic:spPr>
+                </pic:pic>
+              </a:graphicData>
+            </a:graphic>
+          </wp:inline>
+        </w:drawing>
+      </w:r>
+      <w:r>
+        <w:rPr>
+          <w:rtl w:val="0"/>
+        </w:rPr>
+      </w:r>
+    </w:p>
+    <w:p>
+      <w:pPr>
+        <w:rPr>
+          <w:rFonts w:ascii="Times New Roman" w:cs="Times New Roman" w:eastAsia="Times New Roman" w:hAnsi="Times New Roman"/>
+          <w:b w:val="1"/>
+          <w:bCs w:val="1"/>
+          <w:sz w:val="28"/>
+          <w:szCs w:val="28"/>
+        </w:rPr>
+      </w:pPr>
+      <w:r>
+        <w:rPr>
+          <w:rtl w:val="0"/>
+        </w:rPr>
+      </w:r>
+    </w:p>
+    <w:p>
+      <w:pPr>
+        <w:rPr>
+          <w:rFonts w:ascii="Times New Roman" w:cs="Times New Roman" w:eastAsia="Times New Roman" w:hAnsi="Times New Roman"/>
+          <w:b w:val="1"/>
+          <w:bCs w:val="1"/>
+          <w:sz w:val="28"/>
+          <w:szCs w:val="28"/>
+        </w:rPr>
+      </w:pPr>
+      <w:r>
+        <w:rPr>
+          <w:rFonts w:ascii="Times New Roman" w:cs="Times New Roman" w:eastAsia="Times New Roman" w:hAnsi="Times New Roman"/>
+          <w:b w:val="1"/>
+          <w:bCs w:val="1"/>
+          <w:sz w:val="28"/>
+          <w:szCs w:val="28"/>
+        </w:rPr>
+        <w:drawing>
+          <wp:inline distB="114300" distT="114300" distL="114300" distR="114300">
+            <wp:extent cx="4019550" cy="3228975"/>
+            <wp:effectExtent b="0" l="0" r="0" t="0"/>
+            <wp:docPr id="31" name="image35.png"/>
+            <a:graphic>
+              <a:graphicData uri="http://schemas.openxmlformats.org/drawingml/2006/picture">
+                <pic:pic>
+                  <pic:nvPicPr>
+                    <pic:cNvPr id="0" name="image35.png"/>
+                    <pic:cNvPicPr preferRelativeResize="0"/>
+                  </pic:nvPicPr>
+                  <pic:blipFill>
+                    <a:blip r:embed="rId41"/>
+                    <a:srcRect b="0" l="0" r="0" t="0"/>
+                    <a:stretch>
+                      <a:fillRect/>
+                    </a:stretch>
+                  </pic:blipFill>
+                  <pic:spPr>
+                    <a:xfrm>
+                      <a:off x="0" y="0"/>
+                      <a:ext cx="4019550" cy="3228975"/>
+                    </a:xfrm>
+                    <a:prstGeom prst="rect"/>
+                    <a:ln/>
+                  </pic:spPr>
+                </pic:pic>
+              </a:graphicData>
+            </a:graphic>
+          </wp:inline>
+        </w:drawing>
+      </w:r>
+      <w:r>
+        <w:rPr>
+          <w:rtl w:val="0"/>
+        </w:rPr>
+      </w:r>
+    </w:p>
+    <w:p>
+      <w:pPr>
+        <w:rPr>
+          <w:rFonts w:ascii="Times New Roman" w:cs="Times New Roman" w:eastAsia="Times New Roman" w:hAnsi="Times New Roman"/>
+          <w:b w:val="1"/>
+          <w:bCs w:val="1"/>
+          <w:sz w:val="28"/>
+          <w:szCs w:val="28"/>
+        </w:rPr>
+      </w:pPr>
+      <w:r>
+        <w:rPr>
+          <w:rtl w:val="0"/>
+        </w:rPr>
+      </w:r>
+    </w:p>
+    <w:p>
+      <w:pPr>
+        <w:rPr>
+          <w:rFonts w:ascii="Times New Roman" w:cs="Times New Roman" w:eastAsia="Times New Roman" w:hAnsi="Times New Roman"/>
+          <w:b w:val="1"/>
+          <w:bCs w:val="1"/>
+          <w:sz w:val="28"/>
+          <w:szCs w:val="28"/>
+        </w:rPr>
+      </w:pPr>
+      <w:r>
+        <w:rPr>
+          <w:rFonts w:ascii="Times New Roman" w:cs="Times New Roman" w:eastAsia="Times New Roman" w:hAnsi="Times New Roman"/>
+          <w:b w:val="1"/>
+          <w:bCs w:val="1"/>
+          <w:sz w:val="28"/>
+          <w:szCs w:val="28"/>
+          <w:rtl w:val="0"/>
+        </w:rPr>
+        <w:t xml:space="preserve">Question 20</w:t>
+      </w:r>
+    </w:p>
+    <w:p>
+      <w:pPr>
+        <w:rPr>
+          <w:rFonts w:ascii="Times New Roman" w:cs="Times New Roman" w:eastAsia="Times New Roman" w:hAnsi="Times New Roman"/>
+          <w:b w:val="1"/>
+          <w:bCs w:val="1"/>
+          <w:sz w:val="28"/>
+          <w:szCs w:val="28"/>
+        </w:rPr>
+      </w:pPr>
+      <w:r>
+        <w:rPr>
+          <w:rtl w:val="0"/>
+        </w:rPr>
+      </w:r>
+    </w:p>
+    <w:p>
+      <w:pPr>
+        <w:rPr>
+          <w:rFonts w:ascii="Times New Roman" w:cs="Times New Roman" w:eastAsia="Times New Roman" w:hAnsi="Times New Roman"/>
+          <w:b w:val="1"/>
+          <w:bCs w:val="1"/>
+          <w:sz w:val="28"/>
+          <w:szCs w:val="28"/>
+        </w:rPr>
+      </w:pPr>
+      <w:r>
+        <w:rPr>
+          <w:rFonts w:ascii="Times New Roman" w:cs="Times New Roman" w:eastAsia="Times New Roman" w:hAnsi="Times New Roman"/>
+          <w:b w:val="1"/>
+          <w:bCs w:val="1"/>
+          <w:sz w:val="28"/>
+          <w:szCs w:val="28"/>
+        </w:rPr>
+        <w:drawing>
+          <wp:inline distB="114300" distT="114300" distL="114300" distR="114300">
+            <wp:extent cx="5943600" cy="1270000"/>
+            <wp:effectExtent b="0" l="0" r="0" t="0"/>
+            <wp:docPr id="23" name="image26.png"/>
+            <a:graphic>
+              <a:graphicData uri="http://schemas.openxmlformats.org/drawingml/2006/picture">
+                <pic:pic>
+                  <pic:nvPicPr>
+                    <pic:cNvPr id="0" name="image26.png"/>
+                    <pic:cNvPicPr preferRelativeResize="0"/>
+                  </pic:nvPicPr>
+                  <pic:blipFill>
+                    <a:blip r:embed="rId42"/>
+                    <a:srcRect b="0" l="0" r="0" t="0"/>
+                    <a:stretch>
+                      <a:fillRect/>
+                    </a:stretch>
+                  </pic:blipFill>
+                  <pic:spPr>
+                    <a:xfrm>
+                      <a:off x="0" y="0"/>
+                      <a:ext cx="5943600" cy="1270000"/>
+                    </a:xfrm>
+                    <a:prstGeom prst="rect"/>
+                    <a:ln/>
+                  </pic:spPr>
+                </pic:pic>
+              </a:graphicData>
+            </a:graphic>
+          </wp:inline>
+        </w:drawing>
+      </w:r>
+      <w:r>
+        <w:rPr>
+          <w:rtl w:val="0"/>
+        </w:rPr>
+      </w:r>
+    </w:p>
+    <w:p>
+      <w:pPr>
+        <w:rPr>
+          <w:rFonts w:ascii="Times New Roman" w:cs="Times New Roman" w:eastAsia="Times New Roman" w:hAnsi="Times New Roman"/>
+          <w:b w:val="1"/>
+          <w:bCs w:val="1"/>
+          <w:sz w:val="28"/>
+          <w:szCs w:val="28"/>
+        </w:rPr>
+      </w:pPr>
+      <w:r>
+        <w:rPr>
+          <w:rtl w:val="0"/>
+        </w:rPr>
+      </w:r>
+    </w:p>
+    <w:p>
+      <w:pPr>
+        <w:rPr>
+          <w:rFonts w:ascii="Times New Roman" w:cs="Times New Roman" w:eastAsia="Times New Roman" w:hAnsi="Times New Roman"/>
+          <w:b w:val="1"/>
+          <w:bCs w:val="1"/>
+          <w:sz w:val="28"/>
+          <w:szCs w:val="28"/>
+        </w:rPr>
+      </w:pPr>
+      <w:r>
+        <w:rPr>
+          <w:rFonts w:ascii="Times New Roman" w:cs="Times New Roman" w:eastAsia="Times New Roman" w:hAnsi="Times New Roman"/>
+          <w:b w:val="1"/>
+          <w:bCs w:val="1"/>
+          <w:sz w:val="28"/>
+          <w:szCs w:val="28"/>
+        </w:rPr>
+        <w:drawing>
+          <wp:inline distB="114300" distT="114300" distL="114300" distR="114300">
+            <wp:extent cx="5943600" cy="1143000"/>
+            <wp:effectExtent b="0" l="0" r="0" t="0"/>
+            <wp:docPr id="18" name="image12.png"/>
+            <a:graphic>
+              <a:graphicData uri="http://schemas.openxmlformats.org/drawingml/2006/picture">
+                <pic:pic>
+                  <pic:nvPicPr>
+                    <pic:cNvPr id="0" name="image12.png"/>
+                    <pic:cNvPicPr preferRelativeResize="0"/>
+                  </pic:nvPicPr>
+                  <pic:blipFill>
+                    <a:blip r:embed="rId43"/>
+                    <a:srcRect b="0" l="0" r="0" t="0"/>
+                    <a:stretch>
+                      <a:fillRect/>
+                    </a:stretch>
+                  </pic:blipFill>
+                  <pic:spPr>
+                    <a:xfrm>
+                      <a:off x="0" y="0"/>
+                      <a:ext cx="5943600" cy="1143000"/>
+                    </a:xfrm>
+                    <a:prstGeom prst="rect"/>
+                    <a:ln/>
+                  </pic:spPr>
+                </pic:pic>
+              </a:graphicData>
+            </a:graphic>
+          </wp:inline>
+        </w:drawing>
+      </w:r>
+      <w:r>
+        <w:rPr>
+          <w:rtl w:val="0"/>
+        </w:rPr>
+      </w:r>
+    </w:p>
+    <w:p>
+      <w:pPr>
+        <w:rPr>
+          <w:rFonts w:ascii="Times New Roman" w:cs="Times New Roman" w:eastAsia="Times New Roman" w:hAnsi="Times New Roman"/>
+          <w:b w:val="1"/>
+          <w:bCs w:val="1"/>
+          <w:sz w:val="28"/>
+          <w:szCs w:val="28"/>
+        </w:rPr>
+      </w:pPr>
+      <w:r>
+        <w:rPr>
+          <w:rtl w:val="0"/>
+        </w:rPr>
+      </w:r>
+    </w:p>
+    <w:p>
+      <w:pPr>
+        <w:rPr>
+          <w:rFonts w:ascii="Times New Roman" w:cs="Times New Roman" w:eastAsia="Times New Roman" w:hAnsi="Times New Roman"/>
+          <w:b w:val="1"/>
+          <w:bCs w:val="1"/>
+          <w:sz w:val="28"/>
+          <w:szCs w:val="28"/>
+        </w:rPr>
+      </w:pPr>
+      <w:r>
+        <w:rPr>
+          <w:rFonts w:ascii="Times New Roman" w:cs="Times New Roman" w:eastAsia="Times New Roman" w:hAnsi="Times New Roman"/>
+          <w:b w:val="1"/>
+          <w:bCs w:val="1"/>
+          <w:sz w:val="28"/>
+          <w:szCs w:val="28"/>
+          <w:rtl w:val="0"/>
+        </w:rPr>
+        <w:t xml:space="preserve">Question 21</w:t>
+      </w:r>
+    </w:p>
+    <w:p>
+      <w:pPr>
+        <w:rPr>
+          <w:rFonts w:ascii="Times New Roman" w:cs="Times New Roman" w:eastAsia="Times New Roman" w:hAnsi="Times New Roman"/>
+          <w:b w:val="1"/>
+          <w:bCs w:val="1"/>
+          <w:sz w:val="28"/>
+          <w:szCs w:val="28"/>
+        </w:rPr>
+      </w:pPr>
+      <w:r>
+        <w:rPr>
+          <w:rtl w:val="0"/>
+        </w:rPr>
+      </w:r>
+    </w:p>
+    <w:p>
+      <w:pPr>
+        <w:rPr>
+          <w:rFonts w:ascii="Times New Roman" w:cs="Times New Roman" w:eastAsia="Times New Roman" w:hAnsi="Times New Roman"/>
+          <w:b w:val="1"/>
+          <w:bCs w:val="1"/>
+          <w:sz w:val="28"/>
+          <w:szCs w:val="28"/>
+        </w:rPr>
+      </w:pPr>
+      <w:r>
+        <w:rPr>
+          <w:rFonts w:ascii="Times New Roman" w:cs="Times New Roman" w:eastAsia="Times New Roman" w:hAnsi="Times New Roman"/>
+          <w:b w:val="1"/>
+          <w:bCs w:val="1"/>
+          <w:sz w:val="28"/>
+          <w:szCs w:val="28"/>
+        </w:rPr>
+        <w:drawing>
+          <wp:inline distB="114300" distT="114300" distL="114300" distR="114300">
+            <wp:extent cx="5943600" cy="1181100"/>
+            <wp:effectExtent b="0" l="0" r="0" t="0"/>
+            <wp:docPr id="6" name="image40.png"/>
+            <a:graphic>
+              <a:graphicData uri="http://schemas.openxmlformats.org/drawingml/2006/picture">
+                <pic:pic>
+                  <pic:nvPicPr>
+                    <pic:cNvPr id="0" name="image40.png"/>
+                    <pic:cNvPicPr preferRelativeResize="0"/>
+                  </pic:nvPicPr>
+                  <pic:blipFill>
+                    <a:blip r:embed="rId44"/>
+                    <a:srcRect b="0" l="0" r="0" t="0"/>
+                    <a:stretch>
+                      <a:fillRect/>
+                    </a:stretch>
+                  </pic:blipFill>
+                  <pic:spPr>
+                    <a:xfrm>
+                      <a:off x="0" y="0"/>
+                      <a:ext cx="5943600" cy="1181100"/>
+                    </a:xfrm>
+                    <a:prstGeom prst="rect"/>
+                    <a:ln/>
+                  </pic:spPr>
+                </pic:pic>
+              </a:graphicData>
+            </a:graphic>
+          </wp:inline>
+        </w:drawing>
+      </w:r>
+      <w:r>
+        <w:rPr>
+          <w:rFonts w:ascii="Times New Roman" w:cs="Times New Roman" w:eastAsia="Times New Roman" w:hAnsi="Times New Roman"/>
+          <w:b w:val="1"/>
+          <w:bCs w:val="1"/>
+          <w:sz w:val="28"/>
+          <w:szCs w:val="28"/>
+        </w:rPr>
+        <w:drawing>
+          <wp:inline distB="114300" distT="114300" distL="114300" distR="114300">
+            <wp:extent cx="5943600" cy="965200"/>
+            <wp:effectExtent b="0" l="0" r="0" t="0"/>
+            <wp:docPr id="34" name="image31.png"/>
+            <a:graphic>
+              <a:graphicData uri="http://schemas.openxmlformats.org/drawingml/2006/picture">
+                <pic:pic>
+                  <pic:nvPicPr>
+                    <pic:cNvPr id="0" name="image31.png"/>
+                    <pic:cNvPicPr preferRelativeResize="0"/>
+                  </pic:nvPicPr>
+                  <pic:blipFill>
+                    <a:blip r:embed="rId45"/>
+                    <a:srcRect b="0" l="0" r="0" t="0"/>
+                    <a:stretch>
+                      <a:fillRect/>
+                    </a:stretch>
+                  </pic:blipFill>
+                  <pic:spPr>
+                    <a:xfrm>
+                      <a:off x="0" y="0"/>
+                      <a:ext cx="5943600" cy="965200"/>
+                    </a:xfrm>
+                    <a:prstGeom prst="rect"/>
+                    <a:ln/>
+                  </pic:spPr>
+                </pic:pic>
+              </a:graphicData>
+            </a:graphic>
+          </wp:inline>
+        </w:drawing>
+      </w:r>
+      <w:r>
+        <w:rPr>
+          <w:rtl w:val="0"/>
+        </w:rPr>
+      </w:r>
+    </w:p>
+    <w:p>
+      <w:pPr>
+        <w:rPr>
+          <w:rFonts w:ascii="Times New Roman" w:cs="Times New Roman" w:eastAsia="Times New Roman" w:hAnsi="Times New Roman"/>
+          <w:b w:val="1"/>
+          <w:bCs w:val="1"/>
+          <w:sz w:val="28"/>
+          <w:szCs w:val="28"/>
+        </w:rPr>
+      </w:pPr>
+      <w:r>
+        <w:rPr>
+          <w:rtl w:val="0"/>
+        </w:rPr>
+      </w:r>
+    </w:p>
+    <w:p>
+      <w:pPr>
+        <w:rPr>
+          <w:rFonts w:ascii="Times New Roman" w:cs="Times New Roman" w:eastAsia="Times New Roman" w:hAnsi="Times New Roman"/>
+          <w:b w:val="1"/>
+          <w:bCs w:val="1"/>
+          <w:sz w:val="28"/>
+          <w:szCs w:val="28"/>
+        </w:rPr>
+      </w:pPr>
+      <w:r>
+        <w:rPr>
+          <w:rFonts w:ascii="Times New Roman" w:cs="Times New Roman" w:eastAsia="Times New Roman" w:hAnsi="Times New Roman"/>
+          <w:b w:val="1"/>
+          <w:bCs w:val="1"/>
+          <w:sz w:val="28"/>
+          <w:szCs w:val="28"/>
+          <w:rtl w:val="0"/>
+        </w:rPr>
+        <w:t xml:space="preserve">Question 22</w:t>
+      </w:r>
+    </w:p>
+    <w:p>
+      <w:pPr>
+        <w:rPr>
+          <w:rFonts w:ascii="Times New Roman" w:cs="Times New Roman" w:eastAsia="Times New Roman" w:hAnsi="Times New Roman"/>
+          <w:b w:val="1"/>
+          <w:bCs w:val="1"/>
+          <w:sz w:val="28"/>
+          <w:szCs w:val="28"/>
+        </w:rPr>
+      </w:pPr>
+      <w:r>
+        <w:rPr>
+          <w:rtl w:val="0"/>
+        </w:rPr>
+      </w:r>
+    </w:p>
+    <w:p>
+      <w:pPr>
+        <w:rPr>
+          <w:rFonts w:ascii="Times New Roman" w:cs="Times New Roman" w:eastAsia="Times New Roman" w:hAnsi="Times New Roman"/>
+          <w:b w:val="1"/>
+          <w:bCs w:val="1"/>
+          <w:sz w:val="28"/>
+          <w:szCs w:val="28"/>
+        </w:rPr>
+      </w:pPr>
+      <w:r>
+        <w:rPr>
+          <w:rFonts w:ascii="Times New Roman" w:cs="Times New Roman" w:eastAsia="Times New Roman" w:hAnsi="Times New Roman"/>
+          <w:b w:val="1"/>
+          <w:bCs w:val="1"/>
+          <w:sz w:val="28"/>
+          <w:szCs w:val="28"/>
+        </w:rPr>
+        <w:drawing>
+          <wp:inline distB="114300" distT="114300" distL="114300" distR="114300">
+            <wp:extent cx="5943600" cy="1270000"/>
+            <wp:effectExtent b="0" l="0" r="0" t="0"/>
+            <wp:docPr id="24" name="image33.png"/>
+            <a:graphic>
+              <a:graphicData uri="http://schemas.openxmlformats.org/drawingml/2006/picture">
+                <pic:pic>
+                  <pic:nvPicPr>
+                    <pic:cNvPr id="0" name="image33.png"/>
+                    <pic:cNvPicPr preferRelativeResize="0"/>
+                  </pic:nvPicPr>
+                  <pic:blipFill>
+                    <a:blip r:embed="rId46"/>
+                    <a:srcRect b="0" l="0" r="0" t="0"/>
+                    <a:stretch>
+                      <a:fillRect/>
+                    </a:stretch>
+                  </pic:blipFill>
+                  <pic:spPr>
+                    <a:xfrm>
+                      <a:off x="0" y="0"/>
+                      <a:ext cx="5943600" cy="1270000"/>
+                    </a:xfrm>
+                    <a:prstGeom prst="rect"/>
+                    <a:ln/>
+                  </pic:spPr>
+                </pic:pic>
+              </a:graphicData>
+            </a:graphic>
+          </wp:inline>
+        </w:drawing>
+      </w:r>
+      <w:r>
+        <w:rPr>
+          <w:rtl w:val="0"/>
+        </w:rPr>
+      </w:r>
+    </w:p>
+    <w:p>
+      <w:pPr>
+        <w:rPr>
+          <w:rFonts w:ascii="Times New Roman" w:cs="Times New Roman" w:eastAsia="Times New Roman" w:hAnsi="Times New Roman"/>
+          <w:b w:val="1"/>
+          <w:bCs w:val="1"/>
+          <w:sz w:val="28"/>
+          <w:szCs w:val="28"/>
+        </w:rPr>
+      </w:pPr>
+      <w:r>
+        <w:rPr>
+          <w:rtl w:val="0"/>
+        </w:rPr>
+      </w:r>
+    </w:p>
+    <w:p>
+      <w:pPr>
+        <w:rPr>
+          <w:rFonts w:ascii="Times New Roman" w:cs="Times New Roman" w:eastAsia="Times New Roman" w:hAnsi="Times New Roman"/>
+          <w:b w:val="1"/>
+          <w:bCs w:val="1"/>
+          <w:sz w:val="28"/>
+          <w:szCs w:val="28"/>
+        </w:rPr>
+      </w:pPr>
+      <w:r>
+        <w:rPr>
+          <w:rFonts w:ascii="Times New Roman" w:cs="Times New Roman" w:eastAsia="Times New Roman" w:hAnsi="Times New Roman"/>
+          <w:b w:val="1"/>
+          <w:bCs w:val="1"/>
+          <w:sz w:val="28"/>
+          <w:szCs w:val="28"/>
+        </w:rPr>
+        <w:drawing>
+          <wp:inline distB="114300" distT="114300" distL="114300" distR="114300">
+            <wp:extent cx="3038475" cy="1657350"/>
+            <wp:effectExtent b="0" l="0" r="0" t="0"/>
+            <wp:docPr id="16" name="image6.png"/>
+            <a:graphic>
+              <a:graphicData uri="http://schemas.openxmlformats.org/drawingml/2006/picture">
+                <pic:pic>
+                  <pic:nvPicPr>
+                    <pic:cNvPr id="0" name="image6.png"/>
+                    <pic:cNvPicPr preferRelativeResize="0"/>
+                  </pic:nvPicPr>
+                  <pic:blipFill>
+                    <a:blip r:embed="rId47"/>
+                    <a:srcRect b="0" l="0" r="0" t="0"/>
+                    <a:stretch>
+                      <a:fillRect/>
+                    </a:stretch>
+                  </pic:blipFill>
+                  <pic:spPr>
+                    <a:xfrm>
+                      <a:off x="0" y="0"/>
+                      <a:ext cx="3038475" cy="1657350"/>
+                    </a:xfrm>
+                    <a:prstGeom prst="rect"/>
+                    <a:ln/>
+                  </pic:spPr>
+                </pic:pic>
+              </a:graphicData>
+            </a:graphic>
+          </wp:inline>
+        </w:drawing>
+      </w:r>
+      <w:r>
+        <w:rPr>
+          <w:rtl w:val="0"/>
+        </w:rPr>
+      </w:r>
+    </w:p>
+    <w:p>
+      <w:pPr>
+        <w:rPr>
+          <w:rFonts w:ascii="Times New Roman" w:cs="Times New Roman" w:eastAsia="Times New Roman" w:hAnsi="Times New Roman"/>
+          <w:b w:val="1"/>
+          <w:bCs w:val="1"/>
+          <w:sz w:val="28"/>
+          <w:szCs w:val="28"/>
+        </w:rPr>
+      </w:pPr>
+      <w:r>
+        <w:rPr>
+          <w:rtl w:val="0"/>
+        </w:rPr>
+      </w:r>
+    </w:p>
+    <w:p>
+      <w:pPr>
+        <w:rPr>
+          <w:rFonts w:ascii="Times New Roman" w:cs="Times New Roman" w:eastAsia="Times New Roman" w:hAnsi="Times New Roman"/>
+          <w:b w:val="1"/>
+          <w:bCs w:val="1"/>
+          <w:sz w:val="28"/>
+          <w:szCs w:val="28"/>
+        </w:rPr>
+      </w:pPr>
+      <w:r>
+        <w:rPr>
+          <w:rFonts w:ascii="Times New Roman" w:cs="Times New Roman" w:eastAsia="Times New Roman" w:hAnsi="Times New Roman"/>
+          <w:b w:val="1"/>
+          <w:bCs w:val="1"/>
+          <w:sz w:val="28"/>
+          <w:szCs w:val="28"/>
+          <w:rtl w:val="0"/>
+        </w:rPr>
+        <w:t xml:space="preserve">Question 23</w:t>
+      </w:r>
+    </w:p>
+    <w:p>
+      <w:pPr>
+        <w:rPr>
+          <w:rFonts w:ascii="Times New Roman" w:cs="Times New Roman" w:eastAsia="Times New Roman" w:hAnsi="Times New Roman"/>
+          <w:b w:val="1"/>
+          <w:bCs w:val="1"/>
+          <w:sz w:val="28"/>
+          <w:szCs w:val="28"/>
+        </w:rPr>
+      </w:pPr>
+      <w:r>
+        <w:rPr>
+          <w:rtl w:val="0"/>
+        </w:rPr>
+      </w:r>
+    </w:p>
+    <w:p>
+      <w:pPr>
+        <w:rPr>
+          <w:rFonts w:ascii="Times New Roman" w:cs="Times New Roman" w:eastAsia="Times New Roman" w:hAnsi="Times New Roman"/>
+          <w:b w:val="1"/>
+          <w:bCs w:val="1"/>
+          <w:sz w:val="28"/>
+          <w:szCs w:val="28"/>
+        </w:rPr>
+      </w:pPr>
+      <w:r>
+        <w:rPr>
+          <w:rFonts w:ascii="Times New Roman" w:cs="Times New Roman" w:eastAsia="Times New Roman" w:hAnsi="Times New Roman"/>
+          <w:b w:val="1"/>
+          <w:bCs w:val="1"/>
+          <w:sz w:val="28"/>
+          <w:szCs w:val="28"/>
+        </w:rPr>
+        <w:drawing>
+          <wp:inline distB="114300" distT="114300" distL="114300" distR="114300">
+            <wp:extent cx="5943600" cy="1016000"/>
+            <wp:effectExtent b="0" l="0" r="0" t="0"/>
+            <wp:docPr id="17" name="image13.png"/>
+            <a:graphic>
+              <a:graphicData uri="http://schemas.openxmlformats.org/drawingml/2006/picture">
+                <pic:pic>
+                  <pic:nvPicPr>
+                    <pic:cNvPr id="0" name="image13.png"/>
+                    <pic:cNvPicPr preferRelativeResize="0"/>
+                  </pic:nvPicPr>
+                  <pic:blipFill>
+                    <a:blip r:embed="rId48"/>
+                    <a:srcRect b="0" l="0" r="0" t="0"/>
+                    <a:stretch>
+                      <a:fillRect/>
+                    </a:stretch>
+                  </pic:blipFill>
+                  <pic:spPr>
+                    <a:xfrm>
+                      <a:off x="0" y="0"/>
+                      <a:ext cx="5943600" cy="1016000"/>
+                    </a:xfrm>
+                    <a:prstGeom prst="rect"/>
+                    <a:ln/>
+                  </pic:spPr>
+                </pic:pic>
+              </a:graphicData>
+            </a:graphic>
+          </wp:inline>
+        </w:drawing>
+      </w:r>
+      <w:r>
+        <w:rPr>
+          <w:rtl w:val="0"/>
+        </w:rPr>
+      </w:r>
+    </w:p>
+    <w:p>
+      <w:pPr>
+        <w:rPr>
+          <w:rFonts w:ascii="Times New Roman" w:cs="Times New Roman" w:eastAsia="Times New Roman" w:hAnsi="Times New Roman"/>
+          <w:b w:val="1"/>
+          <w:bCs w:val="1"/>
+          <w:sz w:val="28"/>
+          <w:szCs w:val="28"/>
+        </w:rPr>
+      </w:pPr>
+      <w:r>
+        <w:rPr>
+          <w:rtl w:val="0"/>
+        </w:rPr>
+      </w:r>
+    </w:p>
+    <w:p>
+      <w:pPr>
+        <w:rPr>
+          <w:rFonts w:ascii="Times New Roman" w:cs="Times New Roman" w:eastAsia="Times New Roman" w:hAnsi="Times New Roman"/>
+          <w:b w:val="1"/>
+          <w:bCs w:val="1"/>
+          <w:sz w:val="28"/>
+          <w:szCs w:val="28"/>
+        </w:rPr>
+      </w:pPr>
       <w:r>
         <w:rPr>
           <w:rtl w:val="0"/>

</xml_diff>